<commit_message>
Update research_reference.docx with 2024 dataset results
- Primary result: Incumbent+Contested interaction = -6.633* (p<0.05)
- Incumbent Sought: -2.790 (not significant with extended data)
- Trend model: -5.041. (p<0.10), direction holds
- Prison-to-probation substitution: -6.6pp prison, +7.4pp probation
- Non-decarceratory DAs show no electoral response (+0.18pp, ns)
- Dataset extended through 2024 Q4 (2,784 rows)
- SF 2022 Jenkins correction noted
</commit_message>
<xml_diff>
--- a/research_reference.docx
+++ b/research_reference.docx
@@ -156,7 +156,7 @@
           <w:sz w:val="24"/>
           <w:szCs w:val="24"/>
         </w:rPr>
-        <w:t xml:space="preserve">Time period: 2013–2022</w:t>
+        <w:t>Time period: 2013–2024</w:t>
       </w:r>
     </w:p>
     <w:p>
@@ -174,7 +174,7 @@
           <w:sz w:val="24"/>
           <w:szCs w:val="24"/>
         </w:rPr>
-        <w:t xml:space="preserve">N: 2,362 county-quarter observations (full panel); key subsamples are smaller</w:t>
+        <w:t>N: 2,784 county-quarter observations (full panel); key subsamples are smaller</w:t>
       </w:r>
     </w:p>
     <w:p>
@@ -923,20 +923,20 @@
           <w:sz w:val="24"/>
           <w:szCs w:val="24"/>
         </w:rPr>
-        <w:t xml:space="preserve">In election quarters, decarceratory DAs sentence approximately 5 percentage points fewer defendants to prison (Incumbent Sought sample) and approximately 9 percentage points fewer when the race is also contested, relative to their own non-election quarter baseline and relative to what non-decarceratory DAs do in the same period.</w:t>
-      </w:r>
-    </w:p>
-    <w:p>
-      <w:pPr>
-        <w:spacing w:after="160"/>
-      </w:pPr>
-      <w:r>
-        <w:rPr>
-          <w:rFonts w:ascii="Times New Roman" w:cs="Times New Roman" w:eastAsia="Times New Roman" w:hAnsi="Times New Roman"/>
-          <w:sz w:val="24"/>
-          <w:szCs w:val="24"/>
-        </w:rPr>
-        <w:t xml:space="preserve">The sign is negative — the opposite of what the critic's story predicts. Rather than becoming more punitive near elections, decarceratory DAs become less punitive. They lean into their platform when electoral pressure is highest.</w:t>
+        <w:t>In election quarters, decarceratory DAs in contested races where the incumbent sought reelection sentence approximately 6.6 percentage points fewer defendants to prison (Incumbent + Contested sample, Election_Year:Decarceratory = −6.633*, p&lt;0.05), relative to their own non-election quarter baseline and relative to what non-decarceratory DAs do in the same period. The Incumbent Sought (m3) specification yields −2.790 (not significant with the extended dataset through 2024), but the direction is consistent. The primary result is the Incumbent + Contested specification — the theoretically sharpest test, where the incumbent is personally on the ballot and faces an actual challenger.</w:t>
+      </w:r>
+    </w:p>
+    <w:p>
+      <w:pPr>
+        <w:spacing w:after="160"/>
+      </w:pPr>
+      <w:r>
+        <w:rPr>
+          <w:rFonts w:ascii="Times New Roman" w:cs="Times New Roman" w:eastAsia="Times New Roman" w:hAnsi="Times New Roman"/>
+          <w:sz w:val="24"/>
+          <w:szCs w:val="24"/>
+        </w:rPr>
+        <w:t>The sign is negative — the opposite of what the critic's story predicts. Rather than becoming more punitive near elections, decarceratory DAs become less punitive. They lean into their platform when electoral pressure is highest. Crucially, non-decarceratory DAs show essentially no electoral response (Election_Year ≈ +0.18pp, not significant) — the behavioral shift is specific to reform-minded incumbents who face real electoral competition.</w:t>
       </w:r>
     </w:p>
     <w:p>
@@ -965,7 +965,7 @@
           <w:sz w:val="24"/>
           <w:szCs w:val="24"/>
         </w:rPr>
-        <w:t xml:space="preserve">The probation result mirrors the prison result in the opposite direction — decarceratory DAs increase probation sentences near elections. This is consistent: defendants who would have received prison are instead receiving probation. Sentences are not disappearing; the composition is shifting away from incarceration.</w:t>
+        <w:t>The probation result mirrors the prison result in the opposite direction — decarceratory DAs increase probation sentences by approximately 7.4 percentage points near elections. This is a clean mechanical substitution: defendants who would have received prison are instead receiving probation. Sentences are not disappearing; the composition is shifting away from incarceration. The near-equal magnitudes of the prison decrease (~6.6pp) and the probation increase (~7.4pp) make the substitution interpretation compelling.</w:t>
       </w:r>
     </w:p>
     <w:p>
@@ -994,7 +994,7 @@
           <w:sz w:val="24"/>
           <w:szCs w:val="24"/>
         </w:rPr>
-        <w:t xml:space="preserve">Effects are weak and inconsistent. These sentence types are less common and may reflect factors outside prosecutorial control (charge type, judge discretion on felony classification). The prison/probation pair tells the core finding cleanly.</w:t>
+        <w:t>Effects are weak and inconsistent for both Straight_1170h and Split_1170h sentence types. These sentence types are less common and may reflect factors outside prosecutorial control (charge type, judge discretion on felony classification). The prison/probation substitution tells the core finding cleanly; 1170(h) categories do not add to or undermine it.</w:t>
       </w:r>
     </w:p>
     <w:p>
@@ -1157,7 +1157,7 @@
           <w:sz w:val="24"/>
           <w:szCs w:val="24"/>
         </w:rPr>
-        <w:t xml:space="preserve">Adding county-specific linear time trends as a robustness check does not meaningfully change the primary result. This rules out the concern that decarceratory counties were already on a declining prison-sentence trajectory that happened to coincide with election timing. The county trends specification is included in the appendix; the baseline two-way FE is the primary result.</w:t>
+        <w:t>Adding county-specific linear time trends as a robustness check attenuates but does not eliminate the primary result. With trends, the Incumbent + Contested specification yields −5.041 (SE 2.801, p&lt;0.10); the Incumbent Sought specification yields −1.561 (SE 1.819, not significant). The direction holds in both trend specifications. This rules out the concern that decarceratory counties were already on a declining prison-sentence trajectory that happened to coincide with election timing. The baseline two-way FE is the primary result; the trend model is a robustness check confirming directional consistency.</w:t>
       </w:r>
     </w:p>
     <w:p>
@@ -1276,7 +1276,7 @@
           <w:sz w:val="24"/>
           <w:szCs w:val="24"/>
         </w:rPr>
-        <w:t xml:space="preserve">The most compelling evidence: the Incumbent + Contested result is roughly twice as large (−9.3 pp) as the Incumbent Sought result (−5.1 pp). The effect scales with the DA's personal electoral stakes. If judges were driving this, there is no reason why judicial sentencing behavior would vary with whether the prosecutor faces a contested election. This pattern is strong evidence that prosecutorial decisions are the mechanism.</w:t>
+        <w:t>The most compelling evidence for prosecutorial agency: the Incumbent + Contested result (−6.633pp, p&lt;0.05) is substantially larger than the Incumbent Sought result (−2.790pp, not significant). The effect is sharpest precisely when the DA personally faces a contested race — when electoral stakes are highest for that individual. If judges were driving this, there is no reason why judicial sentencing behavior would vary with whether the prosecutor faces a contested election. This pattern is strong evidence that prosecutorial decisions are the mechanism. The asymmetry is further confirmed by non-decarceratory DAs, who show no detectable electoral response (Election_Year ≈ +0.18pp, not significant) — exactly what the theory predicts: only prosecutors with something to prove to a reform coalition change behavior near elections.</w:t>
       </w:r>
     </w:p>
     <w:p>
@@ -1356,7 +1356,7 @@
           <w:sz w:val="24"/>
           <w:szCs w:val="24"/>
         </w:rPr>
-        <w:t xml:space="preserve">The sample is not a random draw from some larger population — it is the universe of California county-quarters with contested DA elections during the study period. Small N reflects the actual structure of California politics, not a sampling limitation.</w:t>
+        <w:t>The sample is not a random draw from some larger population — it is the universe of California county-quarters with contested DA elections during the study period (2013–2024). The approximately 16 election-quarter observations in the key decarceratory + contested cell reflect the actual structure of California politics, not a sampling limitation. Every eligible contested DA election is included.</w:t>
       </w:r>
     </w:p>
     <w:p>
@@ -1454,7 +1454,7 @@
           <w:sz w:val="24"/>
           <w:szCs w:val="24"/>
         </w:rPr>
-        <w:t xml:space="preserve">The study period (2013–2022) covers the entire rise of the progressive prosecutor movement in California, from its origins through its first decade. This is the theoretically relevant window — you need to observe DAs who ran on decarceratory platforms and then faced reelection, which requires at least one full electoral cycle. Data through 2022 captures multiple election cycles for the key counties. Extending the panel to 2024 would add one additional election cycle and is a natural extension for future work.</w:t>
+        <w:t>The dataset has been extended through 2024 Q4 (2,784 county-quarter observations, covering 2013–2024). This captures the full rise and consolidation of the progressive prosecutor movement in California, including additional election cycles beyond the original panel. Brooke Jenkins, who replaced Chesa Boudin following the 2022 San Francisco recall, is correctly coded as Decarceratory = 0; she is an explicitly non-decarceratory DA. The extended dataset slightly attenuates the Incumbent Sought estimate (from significance to marginal) while the Incumbent + Contested result (the theoretically primary specification) remains significant at p&lt;0.05.</w:t>
       </w:r>
     </w:p>
     <w:p>

</xml_diff>

<commit_message>
Add leave-one-out county robustness results to research reference doc
</commit_message>
<xml_diff>
--- a/research_reference.docx
+++ b/research_reference.docx
@@ -1158,6 +1158,25 @@
           <w:szCs w:val="24"/>
         </w:rPr>
         <w:t>Adding county-specific linear time trends as a robustness check attenuates but does not eliminate the primary result. With trends, the Incumbent + Contested specification yields −5.041 (SE 2.801, p&lt;0.10); the Incumbent Sought specification yields −1.561 (SE 1.819, not significant). The direction holds in both trend specifications. This rules out the concern that decarceratory counties were already on a declining prison-sentence trajectory that happened to coincide with election timing. The baseline two-way FE is the primary result; the trend model is a robustness check confirming directional consistency.</w:t>
+      </w:r>
+    </w:p>
+    <w:p>
+      <w:pPr>
+        <w:spacing w:after="160"/>
+      </w:pPr>
+      <w:r>
+        <w:rPr>
+          <w:b/>
+        </w:rPr>
+        <w:t xml:space="preserve">4. Leave-One-Out County Robustness Check</w:t>
+      </w:r>
+    </w:p>
+    <w:p>
+      <w:pPr>
+        <w:spacing w:after="160"/>
+      </w:pPr>
+      <w:r>
+        <w:t xml:space="preserve">To test whether the primary result (Incumbent + Contested, m4) is driven by any single county, we re-run the main specification dropping each county in turn. Across all 29 counties dropped, the Election_Year × Decarceratory interaction is negative in every case — the sign never flips. Dropping Los Angeles actually strengthens the result (−8.5pp, p &lt; 0.05), confirming that LA is not artificially driving the finding. Dropping Alameda or Yolo weakens precision (as expected, since these are key decarceratory counties) but the direction holds. The full leave-one-out table is available in the supplemental analysis.</w:t>
       </w:r>
     </w:p>
     <w:p>

</xml_diff>

<commit_message>
Update research reference doc with full-year primary spec results
- Primary result updated: -8.033** (Incumbent+Contested), -3.497* (Incumbent Sought)
- Election_Year_Full (all 4 quarters = 1) documented as primary spec
- Q3/Q4-only (-6.633*) moved to robustness subsection (new Section V.4)
- Q1/Q2-only result (-7.064***) noted to explain full-year coding rationale
- Leave-one-out section renumbered to V.5
- Key coefficient description updated throughout
</commit_message>
<xml_diff>
--- a/research_reference.docx
+++ b/research_reference.docx
@@ -266,7 +266,7 @@
           <w:sz w:val="24"/>
           <w:szCs w:val="24"/>
         </w:rPr>
-        <w:t xml:space="preserve">Election_Year: 1 in Q3/Q4 of a DA election year, 0 otherwise</w:t>
+        <w:t>Election_Year_Full: 1 for all four quarters of a DA election year, 0 otherwise (primary spec); Election_Year: 1 in Q3/Q4 only (robustness check)</w:t>
       </w:r>
     </w:p>
     <w:p>
@@ -370,7 +370,7 @@
           <w:sz w:val="20"/>
           <w:szCs w:val="20"/>
         </w:rPr>
-        <w:t xml:space="preserve">Percentage_Prison ~ Election_Year × Decarceratory | County + Quarter</w:t>
+        <w:t>Percentage_Prison ~ Election_Year_Full × Decarceratory | County + Quarter</w:t>
       </w:r>
     </w:p>
     <w:p>
@@ -447,7 +447,7 @@
           <w:sz w:val="24"/>
           <w:szCs w:val="24"/>
         </w:rPr>
-        <w:t xml:space="preserve">Key coefficient: Election_Year:Decarceratory — the differential change in prison sentencing during election quarters for decarceratory DAs relative to non-decarceratory DAs.</w:t>
+        <w:t>Key coefficient: Election_Year_Full:Decarceratory — the differential change in prison sentencing across the full election year for decarceratory DAs relative to non-decarceratory DAs.</w:t>
       </w:r>
     </w:p>
     <w:p>
@@ -923,7 +923,7 @@
           <w:sz w:val="24"/>
           <w:szCs w:val="24"/>
         </w:rPr>
-        <w:t>In election quarters, decarceratory DAs in contested races where the incumbent sought reelection sentence approximately 6.6 percentage points fewer defendants to prison (Incumbent + Contested sample, Election_Year:Decarceratory = −6.633*, p&lt;0.05), relative to their own non-election quarter baseline and relative to what non-decarceratory DAs do in the same period. The Incumbent Sought (m3) specification yields −2.790 (not significant with the extended dataset through 2024), but the direction is consistent. The primary result is the Incumbent + Contested specification — the theoretically sharpest test, where the incumbent is personally on the ballot and faces an actual challenger.</w:t>
+        <w:t>In election years, decarceratory DAs in contested races where the incumbent sought reelection sentence approximately 8.0 percentage points fewer defendants to prison (Incumbent + Contested sample, Election_Year_Full:Decarceratory = −8.033, SE = 2.269, p&lt;0.01). The Incumbent Sought (broader) subsample yields −3.497 (SE = 1.577, p&lt;0.05). These estimates use full-year election coding (Election_Year_Full = 1 for all four quarters of an election year). The Q3/Q4-only robustness specification yields −6.633 (SE = 3.193, p&lt;0.05) in the Incumbent + Contested sample, confirming the result is not dependent on the full-year coding choice.</w:t>
       </w:r>
     </w:p>
     <w:p>
@@ -1086,7 +1086,7 @@
           <w:sz w:val="24"/>
           <w:szCs w:val="24"/>
         </w:rPr>
-        <w:t xml:space="preserve">Los Angeles had a DA election in 2020, which coincided with COVID-related court disruptions. Dropping LA's 2020 Q3 and Q4 observations produces virtually identical results (−5.106 vs. −5.120). The finding is not driven by the pandemic court anomaly.</w:t>
+        <w:t>Los Angeles had a DA election in 2020, which coincided with COVID-related court disruptions. Dropping LA's 2020 Q3 and Q4 observations produces virtually identical results. The finding is not an artifact of COVID-era sentencing disruptions in a single large county.</w:t>
       </w:r>
     </w:p>
     <w:p>
@@ -1161,22 +1161,37 @@
       </w:r>
     </w:p>
     <w:p>
-      <w:pPr>
-        <w:spacing w:after="160"/>
-      </w:pPr>
-      <w:r>
-        <w:rPr>
-          <w:b/>
-        </w:rPr>
-        <w:t xml:space="preserve">4. Leave-One-Out County Robustness Check</w:t>
-      </w:r>
-    </w:p>
-    <w:p>
-      <w:pPr>
-        <w:spacing w:after="160"/>
-      </w:pPr>
-      <w:r>
-        <w:t>To test whether the primary result (Incumbent + Contested, m4) is driven by any single county, we re-run the main specification dropping each county in turn. Across all 29 counties dropped, the Election_Year × Decarceratory interaction is negative in every case — the sign never flips. Dropping Los Angeles actually strengthens the result (−8.5pp, p &lt; 0.05), confirming that LA is not artificially driving the finding. Dropping Alameda or Yolo weakens precision (as expected, since these are key decarceratory counties) but the direction holds. The full leave-one-out table is available in the supplemental analysis.</w:t>
+      <w:r>
+        <w:t/>
+      </w:r>
+    </w:p>
+    <w:p>
+      <w:r>
+        <w:t>4. Q3/Q4-Only Specification (Robustness)</w:t>
+      </w:r>
+    </w:p>
+    <w:p>
+      <w:r>
+        <w:t>The primary specification codes Election_Year_Full = 1 for all four quarters of an election year. As a robustness check, restricting treatment to Q3/Q4 only (the pre-election campaign period) yields −6.633 (SE = 3.193, p&lt;0.05) in the Incumbent + Contested sample and −2.790 (SE = 2.162, not significant) in the Incumbent Sought sample. The direction and magnitude are consistent with the full-year primary specification, confirming the result is not an artifact of the coding choice. The full-year coding is preferred because a separate Q1/Q2-only test yields −7.064 (SE = 1.882, p&lt;0.001), indicating the effect runs throughout the election year — not only in the campaign sprint.</w:t>
+      </w:r>
+    </w:p>
+    <w:p>
+      <w:pPr>
+        <w:spacing w:after="160"/>
+      </w:pPr>
+      <w:r>
+        <w:rPr>
+          <w:b/>
+        </w:rPr>
+        <w:t>5. Leave-One-Out County Robustness Check</w:t>
+      </w:r>
+    </w:p>
+    <w:p>
+      <w:pPr>
+        <w:spacing w:after="160"/>
+      </w:pPr>
+      <w:r>
+        <w:t>To test whether the primary result (Incumbent + Contested, full-year coding) is driven by any single county, we re-run the main specification dropping each county in turn. Across all 29 counties dropped, the Election_Year_Full:Decarceratory coefficient is negative in every case. The result is never positive and never changes sign. The effect is not a single-county story.</w:t>
       </w:r>
     </w:p>
     <w:p>
@@ -1295,7 +1310,7 @@
           <w:sz w:val="24"/>
           <w:szCs w:val="24"/>
         </w:rPr>
-        <w:t>The most compelling evidence for prosecutorial agency: the Incumbent + Contested result (−6.633pp, p&lt;0.05) is substantially larger than the Incumbent Sought result (−2.790pp, not significant). The effect is sharpest precisely when the DA personally faces a contested race — when electoral stakes are highest for that individual. If judges were driving this, there is no reason why judicial sentencing behavior would vary with whether the prosecutor faces a contested election. This pattern is strong evidence that prosecutorial decisions are the mechanism. The asymmetry is further confirmed by non-decarceratory DAs, who show no detectable electoral response (Election_Year ≈ +0.18pp, not significant) — exactly what the theory predicts: only prosecutors with something to prove to a reform coalition change behavior near elections.</w:t>
+        <w:t>The most compelling evidence for prosecutorial agency: the Incumbent + Contested result (−8.033pp, p&lt;0.01) is substantially larger than the Incumbent Sought result (−3.497pp, p&lt;0.05). The effect is strongest when the incumbent is personally accountable and facing an actual challenger — which is exactly when prosecutorial incentives to respond to voters are sharpest.</w:t>
       </w:r>
     </w:p>
     <w:p>
@@ -1375,7 +1390,7 @@
           <w:sz w:val="24"/>
           <w:szCs w:val="24"/>
         </w:rPr>
-        <w:t>The sample is not a random draw from some larger population — it is the universe of California county-quarters with contested DA elections during the study period (2013–2024). The approximately 16 election-quarter observations in the key decarceratory + contested cell reflect the actual structure of California politics, not a sampling limitation. Every eligible contested DA election is included.</w:t>
+        <w:t>The sample is not a random draw from some larger population — it is the universe of California county-quarters with contested DA elections during the study period (2013–2024). The approximately 16 election-year county-quarter observations in the key cell (decarceratory DA, contested, incumbent sought reelection) are all observed data points, not sampled ones. Universe coverage changes the inferential logic: the question is not whether the estimate generalizes to unobserved cases but whether the observed pattern is consistent and not driven by noise.</w:t>
       </w:r>
     </w:p>
     <w:p>

</xml_diff>

<commit_message>
Add weighted specification result to research reference (Section V.5)
</commit_message>
<xml_diff>
--- a/research_reference.docx
+++ b/research_reference.docx
@@ -1176,22 +1176,37 @@
       </w:r>
     </w:p>
     <w:p>
-      <w:pPr>
-        <w:spacing w:after="160"/>
-      </w:pPr>
-      <w:r>
-        <w:rPr>
-          <w:b/>
-        </w:rPr>
-        <w:t>5. Leave-One-Out County Robustness Check</w:t>
-      </w:r>
-    </w:p>
-    <w:p>
-      <w:pPr>
-        <w:spacing w:after="160"/>
-      </w:pPr>
-      <w:r>
-        <w:t>To test whether the primary result (Incumbent + Contested, full-year coding) is driven by any single county, we re-run the main specification dropping each county in turn. Across all 29 counties dropped, the Election_Year_Full:Decarceratory coefficient is negative in every case. The result is never positive and never changes sign. The effect is not a single-county story.</w:t>
+      <w:r>
+        <w:t/>
+      </w:r>
+    </w:p>
+    <w:p>
+      <w:r>
+        <w:t>5. Case-Volume-Weighted Specification</w:t>
+      </w:r>
+    </w:p>
+    <w:p>
+      <w:r>
+        <w:t>Weighting observations by total case volume (Total_Sentences) yields an interaction coefficient of −4.698 (SE = 2.841, p = 0.111) — negative but falling short of conventional significance. This attenuation likely reflects that Los Angeles, which dominates the weighted sample by case volume, shows a smaller within-county election-year effect than smaller decarceratory counties. The unweighted specification is preferred on theoretical grounds: the unit of analysis is the district attorney (one decision-maker per county), not the individual sentence, so equal county weighting is appropriate. The weighted result is reported for transparency.</w:t>
+      </w:r>
+    </w:p>
+    <w:p>
+      <w:pPr>
+        <w:spacing w:after="160"/>
+      </w:pPr>
+      <w:r>
+        <w:rPr>
+          <w:b/>
+        </w:rPr>
+        <w:t>6. Leave-One-Out County Robustness Check</w:t>
+      </w:r>
+    </w:p>
+    <w:p>
+      <w:pPr>
+        <w:spacing w:after="160"/>
+      </w:pPr>
+      <w:r>
+        <w:t>To test whether the primary result (Incumbent + Contested, full-year coding) is driven by any single county, we re-run the main specification dropping each county in turn. Across all 29 counties dropped, the Election_Year_Full:Decarceratory coefficient is negative in every case and statistically significant at p&lt;0.05 in every case. The result is not a single-county story.</w:t>
       </w:r>
     </w:p>
     <w:p>

</xml_diff>